<commit_message>
Get User Access (Authentication)
</commit_message>
<xml_diff>
--- a/Documentation/Section27_Authentication_Authorization.docx
+++ b/Documentation/Section27_Authentication_Authorization.docx
@@ -68,7 +68,7 @@
           <w:szCs w:val="24"/>
         </w:rPr>
         <w:pict>
-          <v:rect id="_x0000_i1179" style="width:0;height:1.5pt" o:hralign="center" o:hrstd="t" o:hr="t" fillcolor="#a0a0a0" stroked="f"/>
+          <v:rect id="_x0000_i1025" style="width:0;height:1.5pt" o:hralign="center" o:hrstd="t" o:hr="t" fillcolor="#a0a0a0" stroked="f"/>
         </w:pict>
       </w:r>
     </w:p>
@@ -241,7 +241,7 @@
           <w:szCs w:val="24"/>
         </w:rPr>
         <w:pict>
-          <v:rect id="_x0000_i1149" style="width:0;height:1.5pt" o:hralign="center" o:hrstd="t" o:hr="t" fillcolor="#a0a0a0" stroked="f"/>
+          <v:rect id="_x0000_i1026" style="width:0;height:1.5pt" o:hralign="center" o:hrstd="t" o:hr="t" fillcolor="#a0a0a0" stroked="f"/>
         </w:pict>
       </w:r>
     </w:p>
@@ -500,7 +500,7 @@
           <w:szCs w:val="24"/>
         </w:rPr>
         <w:pict>
-          <v:rect id="_x0000_i1150" style="width:0;height:1.5pt" o:hralign="center" o:hrstd="t" o:hr="t" fillcolor="#a0a0a0" stroked="f"/>
+          <v:rect id="_x0000_i1027" style="width:0;height:1.5pt" o:hralign="center" o:hrstd="t" o:hr="t" fillcolor="#a0a0a0" stroked="f"/>
         </w:pict>
       </w:r>
     </w:p>
@@ -627,7 +627,7 @@
           <w:szCs w:val="24"/>
         </w:rPr>
         <w:pict>
-          <v:rect id="_x0000_i1151" style="width:0;height:1.5pt" o:hralign="center" o:hrstd="t" o:hr="t" fillcolor="#a0a0a0" stroked="f"/>
+          <v:rect id="_x0000_i1028" style="width:0;height:1.5pt" o:hralign="center" o:hrstd="t" o:hr="t" fillcolor="#a0a0a0" stroked="f"/>
         </w:pict>
       </w:r>
     </w:p>
@@ -795,7 +795,7 @@
           <w:szCs w:val="24"/>
         </w:rPr>
         <w:pict>
-          <v:rect id="_x0000_i1152" style="width:0;height:1.5pt" o:hralign="center" o:hrstd="t" o:hr="t" fillcolor="#a0a0a0" stroked="f"/>
+          <v:rect id="_x0000_i1029" style="width:0;height:1.5pt" o:hralign="center" o:hrstd="t" o:hr="t" fillcolor="#a0a0a0" stroked="f"/>
         </w:pict>
       </w:r>
     </w:p>
@@ -1155,7 +1155,7 @@
           <w:szCs w:val="24"/>
         </w:rPr>
         <w:pict>
-          <v:rect id="_x0000_i1153" style="width:0;height:1.5pt" o:hralign="center" o:hrstd="t" o:hr="t" fillcolor="#a0a0a0" stroked="f"/>
+          <v:rect id="_x0000_i1030" style="width:0;height:1.5pt" o:hralign="center" o:hrstd="t" o:hr="t" fillcolor="#a0a0a0" stroked="f"/>
         </w:pict>
       </w:r>
     </w:p>
@@ -1438,7 +1438,7 @@
           <w:szCs w:val="24"/>
         </w:rPr>
         <w:pict>
-          <v:rect id="_x0000_i1154" style="width:0;height:1.5pt" o:hralign="center" o:hrstd="t" o:hr="t" fillcolor="#a0a0a0" stroked="f"/>
+          <v:rect id="_x0000_i1031" style="width:0;height:1.5pt" o:hralign="center" o:hrstd="t" o:hr="t" fillcolor="#a0a0a0" stroked="f"/>
         </w:pict>
       </w:r>
     </w:p>
@@ -1589,7 +1589,7 @@
           <w:szCs w:val="24"/>
         </w:rPr>
         <w:pict>
-          <v:rect id="_x0000_i1155" style="width:0;height:1.5pt" o:hralign="center" o:hrstd="t" o:hr="t" fillcolor="#a0a0a0" stroked="f"/>
+          <v:rect id="_x0000_i1032" style="width:0;height:1.5pt" o:hralign="center" o:hrstd="t" o:hr="t" fillcolor="#a0a0a0" stroked="f"/>
         </w:pict>
       </w:r>
     </w:p>
@@ -2011,7 +2011,7 @@
         </w:rPr>
         <w:lastRenderedPageBreak/>
         <w:pict>
-          <v:rect id="_x0000_i1156" style="width:0;height:1.5pt" o:hralign="center" o:hrstd="t" o:hr="t" fillcolor="#a0a0a0" stroked="f"/>
+          <v:rect id="_x0000_i1033" style="width:0;height:1.5pt" o:hralign="center" o:hrstd="t" o:hr="t" fillcolor="#a0a0a0" stroked="f"/>
         </w:pict>
       </w:r>
     </w:p>
@@ -2206,7 +2206,7 @@
           <w:szCs w:val="24"/>
         </w:rPr>
         <w:pict>
-          <v:rect id="_x0000_i1157" style="width:0;height:1.5pt" o:hralign="center" o:hrstd="t" o:hr="t" fillcolor="#a0a0a0" stroked="f"/>
+          <v:rect id="_x0000_i1034" style="width:0;height:1.5pt" o:hralign="center" o:hrstd="t" o:hr="t" fillcolor="#a0a0a0" stroked="f"/>
         </w:pict>
       </w:r>
     </w:p>
@@ -2397,7 +2397,7 @@
           <w:szCs w:val="24"/>
         </w:rPr>
         <w:pict>
-          <v:rect id="_x0000_i1158" style="width:0;height:1.5pt" o:hralign="center" o:hrstd="t" o:hr="t" fillcolor="#a0a0a0" stroked="f"/>
+          <v:rect id="_x0000_i1035" style="width:0;height:1.5pt" o:hralign="center" o:hrstd="t" o:hr="t" fillcolor="#a0a0a0" stroked="f"/>
         </w:pict>
       </w:r>
     </w:p>
@@ -3438,7 +3438,7 @@
           <w:szCs w:val="24"/>
         </w:rPr>
         <w:pict>
-          <v:rect id="_x0000_i1159" style="width:0;height:1.5pt" o:hralign="center" o:hrstd="t" o:hr="t" fillcolor="#a0a0a0" stroked="f"/>
+          <v:rect id="_x0000_i1036" style="width:0;height:1.5pt" o:hralign="center" o:hrstd="t" o:hr="t" fillcolor="#a0a0a0" stroked="f"/>
         </w:pict>
       </w:r>
     </w:p>
@@ -6967,7 +6967,7 @@
           <w:szCs w:val="24"/>
         </w:rPr>
         <w:pict>
-          <v:rect id="_x0000_i1160" style="width:0;height:1.5pt" o:hralign="center" o:hrstd="t" o:hr="t" fillcolor="#a0a0a0" stroked="f"/>
+          <v:rect id="_x0000_i1037" style="width:0;height:1.5pt" o:hralign="center" o:hrstd="t" o:hr="t" fillcolor="#a0a0a0" stroked="f"/>
         </w:pict>
       </w:r>
     </w:p>
@@ -7058,7 +7058,7 @@
           <w:szCs w:val="24"/>
         </w:rPr>
         <w:pict>
-          <v:rect id="_x0000_i1161" style="width:0;height:1.5pt" o:hralign="center" o:hrstd="t" o:hr="t" fillcolor="#a0a0a0" stroked="f"/>
+          <v:rect id="_x0000_i1038" style="width:0;height:1.5pt" o:hralign="center" o:hrstd="t" o:hr="t" fillcolor="#a0a0a0" stroked="f"/>
         </w:pict>
       </w:r>
     </w:p>
@@ -7286,7 +7286,7 @@
           <w:szCs w:val="24"/>
         </w:rPr>
         <w:pict>
-          <v:rect id="_x0000_i1162" style="width:0;height:1.5pt" o:hralign="center" o:hrstd="t" o:hr="t" fillcolor="#a0a0a0" stroked="f"/>
+          <v:rect id="_x0000_i1039" style="width:0;height:1.5pt" o:hralign="center" o:hrstd="t" o:hr="t" fillcolor="#a0a0a0" stroked="f"/>
         </w:pict>
       </w:r>
     </w:p>
@@ -7481,7 +7481,7 @@
           <w:szCs w:val="24"/>
         </w:rPr>
         <w:pict>
-          <v:rect id="_x0000_i1163" style="width:0;height:1.5pt" o:hralign="center" o:hrstd="t" o:hr="t" fillcolor="#a0a0a0" stroked="f"/>
+          <v:rect id="_x0000_i1040" style="width:0;height:1.5pt" o:hralign="center" o:hrstd="t" o:hr="t" fillcolor="#a0a0a0" stroked="f"/>
         </w:pict>
       </w:r>
     </w:p>
@@ -7645,7 +7645,7 @@
     <w:p>
       <w:r>
         <w:pict>
-          <v:rect id="_x0000_i1164" style="width:0;height:1.5pt" o:hralign="center" o:hrstd="t" o:hr="t" fillcolor="#a0a0a0" stroked="f"/>
+          <v:rect id="_x0000_i1041" style="width:0;height:1.5pt" o:hralign="center" o:hrstd="t" o:hr="t" fillcolor="#a0a0a0" stroked="f"/>
         </w:pict>
       </w:r>
     </w:p>
@@ -7748,7 +7748,7 @@
       </w:pPr>
       <w:r>
         <w:pict>
-          <v:rect id="_x0000_i1165" style="width:0;height:1.5pt" o:hralign="center" o:hrstd="t" o:hr="t" fillcolor="#a0a0a0" stroked="f"/>
+          <v:rect id="_x0000_i1042" style="width:0;height:1.5pt" o:hralign="center" o:hrstd="t" o:hr="t" fillcolor="#a0a0a0" stroked="f"/>
         </w:pict>
       </w:r>
     </w:p>
@@ -7947,7 +7947,7 @@
     <w:p>
       <w:r>
         <w:pict>
-          <v:rect id="_x0000_i1166" style="width:0;height:1.5pt" o:hralign="center" o:hrstd="t" o:hr="t" fillcolor="#a0a0a0" stroked="f"/>
+          <v:rect id="_x0000_i1043" style="width:0;height:1.5pt" o:hralign="center" o:hrstd="t" o:hr="t" fillcolor="#a0a0a0" stroked="f"/>
         </w:pict>
       </w:r>
     </w:p>
@@ -8253,7 +8253,7 @@
     <w:p>
       <w:r>
         <w:pict>
-          <v:rect id="_x0000_i1167" style="width:0;height:1.5pt" o:hralign="center" o:hrstd="t" o:hr="t" fillcolor="#a0a0a0" stroked="f"/>
+          <v:rect id="_x0000_i1044" style="width:0;height:1.5pt" o:hralign="center" o:hrstd="t" o:hr="t" fillcolor="#a0a0a0" stroked="f"/>
         </w:pict>
       </w:r>
     </w:p>
@@ -8521,7 +8521,7 @@
     <w:p>
       <w:r>
         <w:pict>
-          <v:rect id="_x0000_i1168" style="width:0;height:1.5pt" o:hralign="center" o:hrstd="t" o:hr="t" fillcolor="#a0a0a0" stroked="f"/>
+          <v:rect id="_x0000_i1045" style="width:0;height:1.5pt" o:hralign="center" o:hrstd="t" o:hr="t" fillcolor="#a0a0a0" stroked="f"/>
         </w:pict>
       </w:r>
     </w:p>
@@ -10146,7 +10146,7 @@
     <w:p>
       <w:r>
         <w:pict>
-          <v:rect id="_x0000_i1169" style="width:0;height:1.5pt" o:hralign="center" o:hrstd="t" o:hr="t" fillcolor="#a0a0a0" stroked="f"/>
+          <v:rect id="_x0000_i1046" style="width:0;height:1.5pt" o:hralign="center" o:hrstd="t" o:hr="t" fillcolor="#a0a0a0" stroked="f"/>
         </w:pict>
       </w:r>
     </w:p>
@@ -11113,7 +11113,7 @@
     <w:p>
       <w:r>
         <w:pict>
-          <v:rect id="_x0000_i1170" style="width:0;height:1.5pt" o:hralign="center" o:hrstd="t" o:hr="t" fillcolor="#a0a0a0" stroked="f"/>
+          <v:rect id="_x0000_i1047" style="width:0;height:1.5pt" o:hralign="center" o:hrstd="t" o:hr="t" fillcolor="#a0a0a0" stroked="f"/>
         </w:pict>
       </w:r>
     </w:p>
@@ -11710,7 +11710,7 @@
     <w:p>
       <w:r>
         <w:pict>
-          <v:rect id="_x0000_i1171" style="width:0;height:1.5pt" o:hralign="center" o:hrstd="t" o:hr="t" fillcolor="#a0a0a0" stroked="f"/>
+          <v:rect id="_x0000_i1048" style="width:0;height:1.5pt" o:hralign="center" o:hrstd="t" o:hr="t" fillcolor="#a0a0a0" stroked="f"/>
         </w:pict>
       </w:r>
     </w:p>
@@ -11813,7 +11813,7 @@
     <w:p>
       <w:r>
         <w:pict>
-          <v:rect id="_x0000_i1172" style="width:0;height:1.5pt" o:hralign="center" o:hrstd="t" o:hr="t" fillcolor="#a0a0a0" stroked="f"/>
+          <v:rect id="_x0000_i1049" style="width:0;height:1.5pt" o:hralign="center" o:hrstd="t" o:hr="t" fillcolor="#a0a0a0" stroked="f"/>
         </w:pict>
       </w:r>
     </w:p>
@@ -11898,7 +11898,7 @@
       </w:pPr>
       <w:r>
         <w:pict>
-          <v:rect id="_x0000_i1173" style="width:0;height:1.5pt" o:hralign="center" o:hrstd="t" o:hr="t" fillcolor="#a0a0a0" stroked="f"/>
+          <v:rect id="_x0000_i1050" style="width:0;height:1.5pt" o:hralign="center" o:hrstd="t" o:hr="t" fillcolor="#a0a0a0" stroked="f"/>
         </w:pict>
       </w:r>
     </w:p>
@@ -11984,7 +11984,7 @@
       </w:pPr>
       <w:r>
         <w:pict>
-          <v:rect id="_x0000_i1174" style="width:0;height:1.5pt" o:hralign="center" o:hrstd="t" o:hr="t" fillcolor="#a0a0a0" stroked="f"/>
+          <v:rect id="_x0000_i1051" style="width:0;height:1.5pt" o:hralign="center" o:hrstd="t" o:hr="t" fillcolor="#a0a0a0" stroked="f"/>
         </w:pict>
       </w:r>
     </w:p>
@@ -12412,7 +12412,7 @@
     <w:p>
       <w:r>
         <w:pict>
-          <v:rect id="_x0000_i1175" style="width:0;height:1.5pt" o:hralign="center" o:hrstd="t" o:hr="t" fillcolor="#a0a0a0" stroked="f"/>
+          <v:rect id="_x0000_i1052" style="width:0;height:1.5pt" o:hralign="center" o:hrstd="t" o:hr="t" fillcolor="#a0a0a0" stroked="f"/>
         </w:pict>
       </w:r>
     </w:p>
@@ -13422,7 +13422,7 @@
     <w:p>
       <w:r>
         <w:pict>
-          <v:rect id="_x0000_i1176" style="width:0;height:1.5pt" o:hralign="center" o:hrstd="t" o:hr="t" fillcolor="#a0a0a0" stroked="f"/>
+          <v:rect id="_x0000_i1053" style="width:0;height:1.5pt" o:hralign="center" o:hrstd="t" o:hr="t" fillcolor="#a0a0a0" stroked="f"/>
         </w:pict>
       </w:r>
     </w:p>
@@ -13549,7 +13549,7 @@
     <w:p>
       <w:r>
         <w:pict>
-          <v:rect id="_x0000_i1177" style="width:0;height:1.5pt" o:hralign="center" o:hrstd="t" o:hr="t" fillcolor="#a0a0a0" stroked="f"/>
+          <v:rect id="_x0000_i1054" style="width:0;height:1.5pt" o:hralign="center" o:hrstd="t" o:hr="t" fillcolor="#a0a0a0" stroked="f"/>
         </w:pict>
       </w:r>
     </w:p>
@@ -13979,7 +13979,7 @@
     <w:p>
       <w:r>
         <w:pict>
-          <v:rect id="_x0000_i1178" style="width:0;height:1.5pt" o:hralign="center" o:hrstd="t" o:hr="t" fillcolor="#a0a0a0" stroked="f"/>
+          <v:rect id="_x0000_i1055" style="width:0;height:1.5pt" o:hralign="center" o:hrstd="t" o:hr="t" fillcolor="#a0a0a0" stroked="f"/>
         </w:pict>
       </w:r>
     </w:p>
@@ -14146,7 +14146,7 @@
           <w:szCs w:val="24"/>
         </w:rPr>
         <w:pict>
-          <v:rect id="_x0000_i1180" style="width:0;height:1.5pt" o:hralign="center" o:hrstd="t" o:hr="t" fillcolor="#a0a0a0" stroked="f"/>
+          <v:rect id="_x0000_i1056" style="width:0;height:1.5pt" o:hralign="center" o:hrstd="t" o:hr="t" fillcolor="#a0a0a0" stroked="f"/>
         </w:pict>
       </w:r>
     </w:p>
@@ -14292,7 +14292,7 @@
           <w:szCs w:val="24"/>
         </w:rPr>
         <w:pict>
-          <v:rect id="_x0000_i1181" style="width:0;height:1.5pt" o:hralign="center" o:hrstd="t" o:hr="t" fillcolor="#a0a0a0" stroked="f"/>
+          <v:rect id="_x0000_i1057" style="width:0;height:1.5pt" o:hralign="center" o:hrstd="t" o:hr="t" fillcolor="#a0a0a0" stroked="f"/>
         </w:pict>
       </w:r>
     </w:p>
@@ -14488,7 +14488,7 @@
           <w:szCs w:val="24"/>
         </w:rPr>
         <w:pict>
-          <v:rect id="_x0000_i1182" style="width:0;height:1.5pt" o:hralign="center" o:hrstd="t" o:hr="t" fillcolor="#a0a0a0" stroked="f"/>
+          <v:rect id="_x0000_i1058" style="width:0;height:1.5pt" o:hralign="center" o:hrstd="t" o:hr="t" fillcolor="#a0a0a0" stroked="f"/>
         </w:pict>
       </w:r>
     </w:p>
@@ -14703,7 +14703,7 @@
           <w:szCs w:val="24"/>
         </w:rPr>
         <w:pict>
-          <v:rect id="_x0000_i1183" style="width:0;height:1.5pt" o:hralign="center" o:hrstd="t" o:hr="t" fillcolor="#a0a0a0" stroked="f"/>
+          <v:rect id="_x0000_i1059" style="width:0;height:1.5pt" o:hralign="center" o:hrstd="t" o:hr="t" fillcolor="#a0a0a0" stroked="f"/>
         </w:pict>
       </w:r>
     </w:p>
@@ -15342,7 +15342,7 @@
           <w:szCs w:val="24"/>
         </w:rPr>
         <w:pict>
-          <v:rect id="_x0000_i1185" style="width:0;height:1.5pt" o:hralign="center" o:hrstd="t" o:hr="t" fillcolor="#a0a0a0" stroked="f"/>
+          <v:rect id="_x0000_i1060" style="width:0;height:1.5pt" o:hralign="center" o:hrstd="t" o:hr="t" fillcolor="#a0a0a0" stroked="f"/>
         </w:pict>
       </w:r>
     </w:p>
@@ -15416,7 +15416,7 @@
           <w:szCs w:val="24"/>
         </w:rPr>
         <w:pict>
-          <v:rect id="_x0000_i1186" style="width:0;height:1.5pt" o:hralign="center" o:hrstd="t" o:hr="t" fillcolor="#a0a0a0" stroked="f"/>
+          <v:rect id="_x0000_i1061" style="width:0;height:1.5pt" o:hralign="center" o:hrstd="t" o:hr="t" fillcolor="#a0a0a0" stroked="f"/>
         </w:pict>
       </w:r>
     </w:p>
@@ -15697,7 +15697,7 @@
           <w:szCs w:val="24"/>
         </w:rPr>
         <w:pict>
-          <v:rect id="_x0000_i1187" style="width:0;height:1.5pt" o:hralign="center" o:hrstd="t" o:hr="t" fillcolor="#a0a0a0" stroked="f"/>
+          <v:rect id="_x0000_i1062" style="width:0;height:1.5pt" o:hralign="center" o:hrstd="t" o:hr="t" fillcolor="#a0a0a0" stroked="f"/>
         </w:pict>
       </w:r>
     </w:p>
@@ -16371,7 +16371,7 @@
           <w:szCs w:val="24"/>
         </w:rPr>
         <w:pict>
-          <v:rect id="_x0000_i1188" style="width:0;height:1.5pt" o:hralign="center" o:hrstd="t" o:hr="t" fillcolor="#a0a0a0" stroked="f"/>
+          <v:rect id="_x0000_i1063" style="width:0;height:1.5pt" o:hralign="center" o:hrstd="t" o:hr="t" fillcolor="#a0a0a0" stroked="f"/>
         </w:pict>
       </w:r>
     </w:p>
@@ -16490,7 +16490,7 @@
           <w:szCs w:val="24"/>
         </w:rPr>
         <w:pict>
-          <v:rect id="_x0000_i1189" style="width:0;height:1.5pt" o:hralign="center" o:hrstd="t" o:hr="t" fillcolor="#a0a0a0" stroked="f"/>
+          <v:rect id="_x0000_i1064" style="width:0;height:1.5pt" o:hralign="center" o:hrstd="t" o:hr="t" fillcolor="#a0a0a0" stroked="f"/>
         </w:pict>
       </w:r>
     </w:p>
@@ -16582,7 +16582,7 @@
           <w:szCs w:val="24"/>
         </w:rPr>
         <w:pict>
-          <v:rect id="_x0000_i1190" style="width:0;height:1.5pt" o:hralign="center" o:hrstd="t" o:hr="t" fillcolor="#a0a0a0" stroked="f"/>
+          <v:rect id="_x0000_i1065" style="width:0;height:1.5pt" o:hralign="center" o:hrstd="t" o:hr="t" fillcolor="#a0a0a0" stroked="f"/>
         </w:pict>
       </w:r>
     </w:p>
@@ -16932,7 +16932,7 @@
           <w:szCs w:val="24"/>
         </w:rPr>
         <w:pict>
-          <v:rect id="_x0000_i1191" style="width:0;height:1.5pt" o:hralign="center" o:hrstd="t" o:hr="t" fillcolor="#a0a0a0" stroked="f"/>
+          <v:rect id="_x0000_i1066" style="width:0;height:1.5pt" o:hralign="center" o:hrstd="t" o:hr="t" fillcolor="#a0a0a0" stroked="f"/>
         </w:pict>
       </w:r>
     </w:p>
@@ -17161,7 +17161,7 @@
           <w:szCs w:val="24"/>
         </w:rPr>
         <w:pict>
-          <v:rect id="_x0000_i1192" style="width:0;height:1.5pt" o:hralign="center" o:hrstd="t" o:hr="t" fillcolor="#a0a0a0" stroked="f"/>
+          <v:rect id="_x0000_i1067" style="width:0;height:1.5pt" o:hralign="center" o:hrstd="t" o:hr="t" fillcolor="#a0a0a0" stroked="f"/>
         </w:pict>
       </w:r>
     </w:p>
@@ -19004,7 +19004,7 @@
           <w:szCs w:val="24"/>
         </w:rPr>
         <w:pict>
-          <v:rect id="_x0000_i1193" style="width:0;height:1.5pt" o:hralign="center" o:hrstd="t" o:hr="t" fillcolor="#a0a0a0" stroked="f"/>
+          <v:rect id="_x0000_i1068" style="width:0;height:1.5pt" o:hralign="center" o:hrstd="t" o:hr="t" fillcolor="#a0a0a0" stroked="f"/>
         </w:pict>
       </w:r>
     </w:p>
@@ -19096,7 +19096,7 @@
           <w:szCs w:val="24"/>
         </w:rPr>
         <w:pict>
-          <v:rect id="_x0000_i1194" style="width:0;height:1.5pt" o:hralign="center" o:hrstd="t" o:hr="t" fillcolor="#a0a0a0" stroked="f"/>
+          <v:rect id="_x0000_i1069" style="width:0;height:1.5pt" o:hralign="center" o:hrstd="t" o:hr="t" fillcolor="#a0a0a0" stroked="f"/>
         </w:pict>
       </w:r>
     </w:p>
@@ -19233,7 +19233,7 @@
           <w:szCs w:val="24"/>
         </w:rPr>
         <w:pict>
-          <v:rect id="_x0000_i1195" style="width:0;height:1.5pt" o:hralign="center" o:hrstd="t" o:hr="t" fillcolor="#a0a0a0" stroked="f"/>
+          <v:rect id="_x0000_i1070" style="width:0;height:1.5pt" o:hralign="center" o:hrstd="t" o:hr="t" fillcolor="#a0a0a0" stroked="f"/>
         </w:pict>
       </w:r>
     </w:p>
@@ -19380,7 +19380,7 @@
           <w:szCs w:val="24"/>
         </w:rPr>
         <w:pict>
-          <v:rect id="_x0000_i1196" style="width:0;height:1.5pt" o:hralign="center" o:hrstd="t" o:hr="t" fillcolor="#a0a0a0" stroked="f"/>
+          <v:rect id="_x0000_i1071" style="width:0;height:1.5pt" o:hralign="center" o:hrstd="t" o:hr="t" fillcolor="#a0a0a0" stroked="f"/>
         </w:pict>
       </w:r>
     </w:p>
@@ -19544,7 +19544,7 @@
           <w:szCs w:val="24"/>
         </w:rPr>
         <w:pict>
-          <v:rect id="_x0000_i1197" style="width:0;height:1.5pt" o:hralign="center" o:hrstd="t" o:hr="t" fillcolor="#a0a0a0" stroked="f"/>
+          <v:rect id="_x0000_i1072" style="width:0;height:1.5pt" o:hralign="center" o:hrstd="t" o:hr="t" fillcolor="#a0a0a0" stroked="f"/>
         </w:pict>
       </w:r>
     </w:p>
@@ -19635,7 +19635,7 @@
           <w:szCs w:val="24"/>
         </w:rPr>
         <w:pict>
-          <v:rect id="_x0000_i1198" style="width:0;height:1.5pt" o:hralign="center" o:hrstd="t" o:hr="t" fillcolor="#a0a0a0" stroked="f"/>
+          <v:rect id="_x0000_i1073" style="width:0;height:1.5pt" o:hralign="center" o:hrstd="t" o:hr="t" fillcolor="#a0a0a0" stroked="f"/>
         </w:pict>
       </w:r>
     </w:p>
@@ -19973,7 +19973,7 @@
           <w:szCs w:val="24"/>
         </w:rPr>
         <w:pict>
-          <v:rect id="_x0000_i1199" style="width:0;height:1.5pt" o:hralign="center" o:hrstd="t" o:hr="t" fillcolor="#a0a0a0" stroked="f"/>
+          <v:rect id="_x0000_i1074" style="width:0;height:1.5pt" o:hralign="center" o:hrstd="t" o:hr="t" fillcolor="#a0a0a0" stroked="f"/>
         </w:pict>
       </w:r>
     </w:p>
@@ -20244,7 +20244,7 @@
           <w:szCs w:val="24"/>
         </w:rPr>
         <w:pict>
-          <v:rect id="_x0000_i1200" style="width:0;height:1.5pt" o:hralign="center" o:hrstd="t" o:hr="t" fillcolor="#a0a0a0" stroked="f"/>
+          <v:rect id="_x0000_i1075" style="width:0;height:1.5pt" o:hralign="center" o:hrstd="t" o:hr="t" fillcolor="#a0a0a0" stroked="f"/>
         </w:pict>
       </w:r>
     </w:p>
@@ -23289,7 +23289,7 @@
           <w:szCs w:val="24"/>
         </w:rPr>
         <w:pict>
-          <v:rect id="_x0000_i1201" style="width:0;height:1.5pt" o:hralign="center" o:hrstd="t" o:hr="t" fillcolor="#a0a0a0" stroked="f"/>
+          <v:rect id="_x0000_i1076" style="width:0;height:1.5pt" o:hralign="center" o:hrstd="t" o:hr="t" fillcolor="#a0a0a0" stroked="f"/>
         </w:pict>
       </w:r>
     </w:p>
@@ -23422,7 +23422,7 @@
           <w:szCs w:val="24"/>
         </w:rPr>
         <w:pict>
-          <v:rect id="_x0000_i1202" style="width:0;height:1.5pt" o:hralign="center" o:hrstd="t" o:hr="t" fillcolor="#a0a0a0" stroked="f"/>
+          <v:rect id="_x0000_i1077" style="width:0;height:1.5pt" o:hralign="center" o:hrstd="t" o:hr="t" fillcolor="#a0a0a0" stroked="f"/>
         </w:pict>
       </w:r>
     </w:p>
@@ -23578,7 +23578,7 @@
           <w:szCs w:val="24"/>
         </w:rPr>
         <w:pict>
-          <v:rect id="_x0000_i1203" style="width:0;height:1.5pt" o:hralign="center" o:hrstd="t" o:hr="t" fillcolor="#a0a0a0" stroked="f"/>
+          <v:rect id="_x0000_i1078" style="width:0;height:1.5pt" o:hralign="center" o:hrstd="t" o:hr="t" fillcolor="#a0a0a0" stroked="f"/>
         </w:pict>
       </w:r>
     </w:p>
@@ -23670,7 +23670,7 @@
           <w:szCs w:val="24"/>
         </w:rPr>
         <w:pict>
-          <v:rect id="_x0000_i1204" style="width:0;height:1.5pt" o:hralign="center" o:hrstd="t" o:hr="t" fillcolor="#a0a0a0" stroked="f"/>
+          <v:rect id="_x0000_i1079" style="width:0;height:1.5pt" o:hralign="center" o:hrstd="t" o:hr="t" fillcolor="#a0a0a0" stroked="f"/>
         </w:pict>
       </w:r>
     </w:p>
@@ -23834,7 +23834,7 @@
           <w:szCs w:val="24"/>
         </w:rPr>
         <w:pict>
-          <v:rect id="_x0000_i1205" style="width:0;height:1.5pt" o:hralign="center" o:hrstd="t" o:hr="t" fillcolor="#a0a0a0" stroked="f"/>
+          <v:rect id="_x0000_i1080" style="width:0;height:1.5pt" o:hralign="center" o:hrstd="t" o:hr="t" fillcolor="#a0a0a0" stroked="f"/>
         </w:pict>
       </w:r>
     </w:p>
@@ -24940,7 +24940,7 @@
           <w:szCs w:val="24"/>
         </w:rPr>
         <w:pict>
-          <v:rect id="_x0000_i1206" style="width:0;height:1.5pt" o:hralign="center" o:hrstd="t" o:hr="t" fillcolor="#a0a0a0" stroked="f"/>
+          <v:rect id="_x0000_i1081" style="width:0;height:1.5pt" o:hralign="center" o:hrstd="t" o:hr="t" fillcolor="#a0a0a0" stroked="f"/>
         </w:pict>
       </w:r>
     </w:p>
@@ -25152,7 +25152,7 @@
           <w:szCs w:val="24"/>
         </w:rPr>
         <w:pict>
-          <v:rect id="_x0000_i1207" style="width:0;height:1.5pt" o:hralign="center" o:hrstd="t" o:hr="t" fillcolor="#a0a0a0" stroked="f"/>
+          <v:rect id="_x0000_i1082" style="width:0;height:1.5pt" o:hralign="center" o:hrstd="t" o:hr="t" fillcolor="#a0a0a0" stroked="f"/>
         </w:pict>
       </w:r>
     </w:p>
@@ -25511,7 +25511,7 @@
           <w:szCs w:val="24"/>
         </w:rPr>
         <w:pict>
-          <v:rect id="_x0000_i1208" style="width:0;height:1.5pt" o:hralign="center" o:hrstd="t" o:hr="t" fillcolor="#a0a0a0" stroked="f"/>
+          <v:rect id="_x0000_i1083" style="width:0;height:1.5pt" o:hralign="center" o:hrstd="t" o:hr="t" fillcolor="#a0a0a0" stroked="f"/>
         </w:pict>
       </w:r>
     </w:p>
@@ -25735,7 +25735,7 @@
           <w:szCs w:val="24"/>
         </w:rPr>
         <w:pict>
-          <v:rect id="_x0000_i1209" style="width:0;height:1.5pt" o:hralign="center" o:hrstd="t" o:hr="t" fillcolor="#a0a0a0" stroked="f"/>
+          <v:rect id="_x0000_i1084" style="width:0;height:1.5pt" o:hralign="center" o:hrstd="t" o:hr="t" fillcolor="#a0a0a0" stroked="f"/>
         </w:pict>
       </w:r>
     </w:p>
@@ -25952,7 +25952,7 @@
         </w:rPr>
         <w:lastRenderedPageBreak/>
         <w:pict>
-          <v:rect id="_x0000_i1210" style="width:0;height:1.5pt" o:hralign="center" o:hrstd="t" o:hr="t" fillcolor="#a0a0a0" stroked="f"/>
+          <v:rect id="_x0000_i1085" style="width:0;height:1.5pt" o:hralign="center" o:hrstd="t" o:hr="t" fillcolor="#a0a0a0" stroked="f"/>
         </w:pict>
       </w:r>
     </w:p>
@@ -26197,7 +26197,7 @@
           <w:szCs w:val="24"/>
         </w:rPr>
         <w:pict>
-          <v:rect id="_x0000_i1211" style="width:0;height:1.5pt" o:hralign="center" o:hrstd="t" o:hr="t" fillcolor="#a0a0a0" stroked="f"/>
+          <v:rect id="_x0000_i1086" style="width:0;height:1.5pt" o:hralign="center" o:hrstd="t" o:hr="t" fillcolor="#a0a0a0" stroked="f"/>
         </w:pict>
       </w:r>
     </w:p>
@@ -28541,7 +28541,7 @@
           <w:szCs w:val="24"/>
         </w:rPr>
         <w:pict>
-          <v:rect id="_x0000_i1245" style="width:0;height:1.5pt" o:hralign="center" o:hrstd="t" o:hr="t" fillcolor="#a0a0a0" stroked="f"/>
+          <v:rect id="_x0000_i1087" style="width:0;height:1.5pt" o:hralign="center" o:hrstd="t" o:hr="t" fillcolor="#a0a0a0" stroked="f"/>
         </w:pict>
       </w:r>
     </w:p>
@@ -28669,7 +28669,7 @@
           <w:szCs w:val="24"/>
         </w:rPr>
         <w:pict>
-          <v:rect id="_x0000_i1246" style="width:0;height:1.5pt" o:hralign="center" o:hrstd="t" o:hr="t" fillcolor="#a0a0a0" stroked="f"/>
+          <v:rect id="_x0000_i1088" style="width:0;height:1.5pt" o:hralign="center" o:hrstd="t" o:hr="t" fillcolor="#a0a0a0" stroked="f"/>
         </w:pict>
       </w:r>
     </w:p>
@@ -28779,7 +28779,7 @@
           <w:szCs w:val="24"/>
         </w:rPr>
         <w:pict>
-          <v:rect id="_x0000_i1247" style="width:0;height:1.5pt" o:hralign="center" o:hrstd="t" o:hr="t" fillcolor="#a0a0a0" stroked="f"/>
+          <v:rect id="_x0000_i1089" style="width:0;height:1.5pt" o:hralign="center" o:hrstd="t" o:hr="t" fillcolor="#a0a0a0" stroked="f"/>
         </w:pict>
       </w:r>
     </w:p>
@@ -28889,7 +28889,7 @@
           <w:szCs w:val="24"/>
         </w:rPr>
         <w:pict>
-          <v:rect id="_x0000_i1248" style="width:0;height:1.5pt" o:hralign="center" o:hrstd="t" o:hr="t" fillcolor="#a0a0a0" stroked="f"/>
+          <v:rect id="_x0000_i1090" style="width:0;height:1.5pt" o:hralign="center" o:hrstd="t" o:hr="t" fillcolor="#a0a0a0" stroked="f"/>
         </w:pict>
       </w:r>
     </w:p>
@@ -29162,7 +29162,7 @@
           <w:szCs w:val="24"/>
         </w:rPr>
         <w:pict>
-          <v:rect id="_x0000_i1249" style="width:0;height:1.5pt" o:hralign="center" o:hrstd="t" o:hr="t" fillcolor="#a0a0a0" stroked="f"/>
+          <v:rect id="_x0000_i1091" style="width:0;height:1.5pt" o:hralign="center" o:hrstd="t" o:hr="t" fillcolor="#a0a0a0" stroked="f"/>
         </w:pict>
       </w:r>
     </w:p>
@@ -29340,7 +29340,7 @@
           <w:szCs w:val="24"/>
         </w:rPr>
         <w:pict>
-          <v:rect id="_x0000_i1250" style="width:0;height:1.5pt" o:hralign="center" o:hrstd="t" o:hr="t" fillcolor="#a0a0a0" stroked="f"/>
+          <v:rect id="_x0000_i1092" style="width:0;height:1.5pt" o:hralign="center" o:hrstd="t" o:hr="t" fillcolor="#a0a0a0" stroked="f"/>
         </w:pict>
       </w:r>
     </w:p>
@@ -29516,7 +29516,7 @@
           <w:szCs w:val="24"/>
         </w:rPr>
         <w:pict>
-          <v:rect id="_x0000_i1251" style="width:0;height:1.5pt" o:hralign="center" o:hrstd="t" o:hr="t" fillcolor="#a0a0a0" stroked="f"/>
+          <v:rect id="_x0000_i1093" style="width:0;height:1.5pt" o:hralign="center" o:hrstd="t" o:hr="t" fillcolor="#a0a0a0" stroked="f"/>
         </w:pict>
       </w:r>
     </w:p>
@@ -29631,7 +29631,7 @@
           <w:szCs w:val="24"/>
         </w:rPr>
         <w:pict>
-          <v:rect id="_x0000_i1252" style="width:0;height:1.5pt" o:hralign="center" o:hrstd="t" o:hr="t" fillcolor="#a0a0a0" stroked="f"/>
+          <v:rect id="_x0000_i1094" style="width:0;height:1.5pt" o:hralign="center" o:hrstd="t" o:hr="t" fillcolor="#a0a0a0" stroked="f"/>
         </w:pict>
       </w:r>
     </w:p>
@@ -29692,7 +29692,7 @@
           <w:szCs w:val="24"/>
         </w:rPr>
         <w:pict>
-          <v:rect id="_x0000_i1253" style="width:0;height:1.5pt" o:hralign="center" o:hrstd="t" o:hr="t" fillcolor="#a0a0a0" stroked="f"/>
+          <v:rect id="_x0000_i1095" style="width:0;height:1.5pt" o:hralign="center" o:hrstd="t" o:hr="t" fillcolor="#a0a0a0" stroked="f"/>
         </w:pict>
       </w:r>
     </w:p>
@@ -29918,69 +29918,6 @@
           <w:szCs w:val="24"/>
         </w:rPr>
       </w:pPr>
-    </w:p>
-    <w:p>
-      <w:pPr>
-        <w:spacing w:before="100" w:beforeAutospacing="1" w:after="100" w:afterAutospacing="1" w:line="240" w:lineRule="auto"/>
-        <w:outlineLvl w:val="0"/>
-        <w:rPr>
-          <w:rFonts w:ascii="Times New Roman" w:eastAsia="Times New Roman" w:hAnsi="Times New Roman" w:cs="Times New Roman"/>
-          <w:b/>
-          <w:bCs/>
-          <w:kern w:val="36"/>
-          <w:sz w:val="48"/>
-          <w:szCs w:val="48"/>
-        </w:rPr>
-      </w:pPr>
-      <w:r>
-        <w:rPr>
-          <w:rFonts w:ascii="Times New Roman" w:eastAsia="Times New Roman" w:hAnsi="Times New Roman" w:cs="Times New Roman"/>
-          <w:b/>
-          <w:bCs/>
-          <w:kern w:val="36"/>
-          <w:sz w:val="48"/>
-          <w:szCs w:val="48"/>
-          <w:highlight w:val="yellow"/>
-        </w:rPr>
-        <w:t xml:space="preserve">Chapter 106 (Continue): </w:t>
-      </w:r>
-      <w:r>
-        <w:rPr>
-          <w:rFonts w:ascii="Times New Roman" w:eastAsia="Times New Roman" w:hAnsi="Times New Roman" w:cs="Times New Roman"/>
-          <w:b/>
-          <w:bCs/>
-          <w:kern w:val="36"/>
-          <w:sz w:val="48"/>
-          <w:szCs w:val="48"/>
-          <w:highlight w:val="yellow"/>
-        </w:rPr>
-        <w:t>Get Current User</w:t>
-      </w:r>
-    </w:p>
-    <w:p>
-      <w:pPr>
-        <w:spacing w:before="100" w:beforeAutospacing="1" w:after="100" w:afterAutospacing="1" w:line="240" w:lineRule="auto"/>
-        <w:outlineLvl w:val="0"/>
-        <w:rPr>
-          <w:rFonts w:ascii="Times New Roman" w:eastAsia="Times New Roman" w:hAnsi="Times New Roman" w:cs="Times New Roman"/>
-          <w:b/>
-          <w:bCs/>
-          <w:kern w:val="36"/>
-          <w:sz w:val="48"/>
-          <w:szCs w:val="48"/>
-        </w:rPr>
-      </w:pPr>
-      <w:r>
-        <w:rPr>
-          <w:rFonts w:ascii="Times New Roman" w:eastAsia="Times New Roman" w:hAnsi="Times New Roman" w:cs="Times New Roman"/>
-          <w:b/>
-          <w:bCs/>
-          <w:kern w:val="36"/>
-          <w:sz w:val="48"/>
-          <w:szCs w:val="48"/>
-        </w:rPr>
-        <w:t xml:space="preserve">We get detail of currently login user </w:t>
-      </w:r>
     </w:p>
     <w:p>
       <w:pPr>

</xml_diff>